<commit_message>
CIV-17696 updated the typo (#7004)
</commit_message>
<xml_diff>
--- a/docker/docmosis/templates/CV-UNS-GAP-ENG-01077.docx
+++ b/docker/docmosis/templates/CV-UNS-GAP-ENG-01077.docx
@@ -1,6 +1,6 @@
 
 <file path=word/document.xml><?xml version="1.0" encoding="utf-8"?>
-<w:document xmlns:wpc="http://schemas.microsoft.com/office/word/2010/wordprocessingCanvas" xmlns:cx="http://schemas.microsoft.com/office/drawing/2014/chartex" xmlns:cx1="http://schemas.microsoft.com/office/drawing/2015/9/8/chartex" xmlns:cx2="http://schemas.microsoft.com/office/drawing/2015/10/21/chartex" xmlns:cx3="http://schemas.microsoft.com/office/drawing/2016/5/9/chartex" xmlns:cx4="http://schemas.microsoft.com/office/drawing/2016/5/10/chartex" xmlns:cx5="http://schemas.microsoft.com/office/drawing/2016/5/11/chartex" xmlns:cx6="http://schemas.microsoft.com/office/drawing/2016/5/12/chartex" xmlns:cx7="http://schemas.microsoft.com/office/drawing/2016/5/13/chartex" xmlns:cx8="http://schemas.microsoft.com/office/drawing/2016/5/14/chartex" xmlns:mc="http://schemas.openxmlformats.org/markup-compatibility/2006" xmlns:aink="http://schemas.microsoft.com/office/drawing/2016/ink" xmlns:am3d="http://schemas.microsoft.com/office/drawing/2017/model3d" xmlns:o="urn:schemas-microsoft-com:office:office" xmlns:oel="http://schemas.microsoft.com/office/2019/extlst" xmlns:r="http://schemas.openxmlformats.org/officeDocument/2006/relationships" xmlns:m="http://schemas.openxmlformats.org/officeDocument/2006/math" xmlns:v="urn:schemas-microsoft-com:vml" xmlns:wp14="http://schemas.microsoft.com/office/word/2010/wordprocessingDrawing" xmlns:wp="http://schemas.openxmlformats.org/drawingml/2006/wordprocessingDrawing" xmlns:w10="urn:schemas-microsoft-com:office:word" xmlns:w="http://schemas.openxmlformats.org/wordprocessingml/2006/main" xmlns:w14="http://schemas.microsoft.com/office/word/2010/wordml" xmlns:w15="http://schemas.microsoft.com/office/word/2012/wordml" xmlns:w16cex="http://schemas.microsoft.com/office/word/2018/wordml/cex" xmlns:w16cid="http://schemas.microsoft.com/office/word/2016/wordml/cid" xmlns:w16="http://schemas.microsoft.com/office/word/2018/wordml" xmlns:w16du="http://schemas.microsoft.com/office/word/2023/wordml/word16du" xmlns:w16sdtdh="http://schemas.microsoft.com/office/word/2020/wordml/sdtdatahash" xmlns:w16se="http://schemas.microsoft.com/office/word/2015/wordml/symex" xmlns:wpg="http://schemas.microsoft.com/office/word/2010/wordprocessingGroup" xmlns:wpi="http://schemas.microsoft.com/office/word/2010/wordprocessingInk" xmlns:wne="http://schemas.microsoft.com/office/word/2006/wordml" xmlns:wps="http://schemas.microsoft.com/office/word/2010/wordprocessingShape" mc:Ignorable="w14 w15 w16se w16cid w16 w16cex w16sdtdh w16du wp14">
+<w:document xmlns:wpc="http://schemas.microsoft.com/office/word/2010/wordprocessingCanvas" xmlns:cx="http://schemas.microsoft.com/office/drawing/2014/chartex" xmlns:cx1="http://schemas.microsoft.com/office/drawing/2015/9/8/chartex" xmlns:cx2="http://schemas.microsoft.com/office/drawing/2015/10/21/chartex" xmlns:cx3="http://schemas.microsoft.com/office/drawing/2016/5/9/chartex" xmlns:cx4="http://schemas.microsoft.com/office/drawing/2016/5/10/chartex" xmlns:cx5="http://schemas.microsoft.com/office/drawing/2016/5/11/chartex" xmlns:cx6="http://schemas.microsoft.com/office/drawing/2016/5/12/chartex" xmlns:cx7="http://schemas.microsoft.com/office/drawing/2016/5/13/chartex" xmlns:cx8="http://schemas.microsoft.com/office/drawing/2016/5/14/chartex" xmlns:mc="http://schemas.openxmlformats.org/markup-compatibility/2006" xmlns:aink="http://schemas.microsoft.com/office/drawing/2016/ink" xmlns:am3d="http://schemas.microsoft.com/office/drawing/2017/model3d" xmlns:o="urn:schemas-microsoft-com:office:office" xmlns:oel="http://schemas.microsoft.com/office/2019/extlst" xmlns:r="http://schemas.openxmlformats.org/officeDocument/2006/relationships" xmlns:m="http://schemas.openxmlformats.org/officeDocument/2006/math" xmlns:v="urn:schemas-microsoft-com:vml" xmlns:wp14="http://schemas.microsoft.com/office/word/2010/wordprocessingDrawing" xmlns:wp="http://schemas.openxmlformats.org/drawingml/2006/wordprocessingDrawing" xmlns:w10="urn:schemas-microsoft-com:office:word" xmlns:w="http://schemas.openxmlformats.org/wordprocessingml/2006/main" xmlns:w14="http://schemas.microsoft.com/office/word/2010/wordml" xmlns:w15="http://schemas.microsoft.com/office/word/2012/wordml" xmlns:w16cex="http://schemas.microsoft.com/office/word/2018/wordml/cex" xmlns:w16cid="http://schemas.microsoft.com/office/word/2016/wordml/cid" xmlns:w16="http://schemas.microsoft.com/office/word/2018/wordml" xmlns:w16du="http://schemas.microsoft.com/office/word/2023/wordml/word16du" xmlns:w16sdtdh="http://schemas.microsoft.com/office/word/2020/wordml/sdtdatahash" xmlns:w16sdtfl="http://schemas.microsoft.com/office/word/2024/wordml/sdtformatlock" xmlns:w16se="http://schemas.microsoft.com/office/word/2015/wordml/symex" xmlns:wpg="http://schemas.microsoft.com/office/word/2010/wordprocessingGroup" xmlns:wpi="http://schemas.microsoft.com/office/word/2010/wordprocessingInk" xmlns:wne="http://schemas.microsoft.com/office/word/2006/wordml" xmlns:wps="http://schemas.microsoft.com/office/word/2010/wordprocessingShape" mc:Ignorable="w14 w15 w16se w16cid w16 w16cex w16sdtdh w16sdtfl w16du wp14">
   <w:body>
     <w:tbl>
       <w:tblPr>
@@ -826,22 +826,16 @@
             <w:r>
               <w:t>&lt;&lt;</w:t>
             </w:r>
-            <w:r>
-              <w:t>cs_{</w:t>
-            </w:r>
             <w:proofErr w:type="spellStart"/>
             <w:r>
-              <w:t>hasAgreed</w:t>
+              <w:rPr>
+                <w:rFonts w:cstheme="minorHAnsi"/>
+              </w:rPr>
+              <w:t>isWithNotice</w:t>
             </w:r>
             <w:proofErr w:type="spellEnd"/>
             <w:r>
-              <w:t>==’Yes’}</w:t>
-            </w:r>
-            <w:r>
-              <w:t>&gt;&gt;</w:t>
-            </w:r>
-            <w:r>
-              <w:t xml:space="preserve"> No &lt;&lt;else&gt;&gt; Yes &lt;&lt;es_&gt;&gt; </w:t>
+              <w:t xml:space="preserve">&gt;&gt; </w:t>
             </w:r>
           </w:p>
         </w:tc>
@@ -3506,7 +3500,6 @@
               <w:bottom w:val="single" w:sz="4" w:space="0" w:color="auto"/>
               <w:right w:val="nil"/>
             </w:tcBorders>
-            <w:hideMark/>
           </w:tcPr>
           <w:p>
             <w:pPr>
@@ -3514,6 +3507,156 @@
               <w:spacing w:before="0" w:beforeAutospacing="0" w:after="0" w:afterAutospacing="0"/>
               <w:textAlignment w:val="baseline"/>
               <w:rPr>
+                <w:rStyle w:val="normaltextrun"/>
+                <w:rFonts w:asciiTheme="minorHAnsi" w:hAnsiTheme="minorHAnsi" w:cstheme="minorHAnsi"/>
+                <w:color w:val="000000"/>
+                <w:lang w:eastAsia="en-US"/>
+              </w:rPr>
+            </w:pPr>
+            <w:r>
+              <w:rPr>
+                <w:rFonts w:ascii="Arial" w:hAnsi="Arial" w:cs="Arial"/>
+                <w:sz w:val="16"/>
+                <w:szCs w:val="16"/>
+              </w:rPr>
+              <w:t>&lt;&lt;</w:t>
+            </w:r>
+            <w:proofErr w:type="spellStart"/>
+            <w:r>
+              <w:rPr>
+                <w:rFonts w:ascii="Arial" w:hAnsi="Arial" w:cs="Arial"/>
+                <w:sz w:val="16"/>
+                <w:szCs w:val="16"/>
+              </w:rPr>
+              <w:t>cr</w:t>
+            </w:r>
+            <w:proofErr w:type="spellEnd"/>
+            <w:r>
+              <w:rPr>
+                <w:rFonts w:ascii="Arial" w:hAnsi="Arial" w:cs="Arial"/>
+                <w:sz w:val="16"/>
+                <w:szCs w:val="16"/>
+              </w:rPr>
+              <w:t>_{</w:t>
+            </w:r>
+            <w:proofErr w:type="gramStart"/>
+            <w:r>
+              <w:rPr>
+                <w:rFonts w:ascii="Arial" w:hAnsi="Arial" w:cs="Arial"/>
+                <w:sz w:val="16"/>
+                <w:szCs w:val="16"/>
+              </w:rPr>
+              <w:t>role!=</w:t>
+            </w:r>
+            <w:proofErr w:type="gramEnd"/>
+            <w:r>
+              <w:rPr>
+                <w:rFonts w:ascii="Arial" w:hAnsi="Arial" w:cs="Arial"/>
+                <w:sz w:val="16"/>
+                <w:szCs w:val="16"/>
+              </w:rPr>
+              <w:t>null}&gt;&gt;</w:t>
+            </w:r>
+          </w:p>
+        </w:tc>
+      </w:tr>
+      <w:tr>
+        <w:tc>
+          <w:tcPr>
+            <w:tcW w:w="9067" w:type="dxa"/>
+            <w:tcBorders>
+              <w:top w:val="single" w:sz="4" w:space="0" w:color="auto"/>
+              <w:left w:val="nil"/>
+              <w:bottom w:val="single" w:sz="4" w:space="0" w:color="auto"/>
+              <w:right w:val="nil"/>
+            </w:tcBorders>
+          </w:tcPr>
+          <w:p>
+            <w:pPr>
+              <w:pStyle w:val="paragraph"/>
+              <w:spacing w:before="0" w:beforeAutospacing="0" w:after="0" w:afterAutospacing="0"/>
+              <w:textAlignment w:val="baseline"/>
+              <w:rPr>
+                <w:rStyle w:val="normaltextrun"/>
+                <w:rFonts w:asciiTheme="minorHAnsi" w:hAnsiTheme="minorHAnsi" w:cstheme="minorHAnsi"/>
+                <w:color w:val="000000"/>
+                <w:lang w:eastAsia="en-US"/>
+              </w:rPr>
+            </w:pPr>
+            <w:r>
+              <w:rPr>
+                <w:rFonts w:asciiTheme="minorHAnsi" w:hAnsiTheme="minorHAnsi" w:cstheme="minorHAnsi"/>
+              </w:rPr>
+              <w:t>&lt;&lt;role&gt;&gt;</w:t>
+            </w:r>
+          </w:p>
+        </w:tc>
+      </w:tr>
+      <w:tr>
+        <w:tc>
+          <w:tcPr>
+            <w:tcW w:w="9067" w:type="dxa"/>
+            <w:tcBorders>
+              <w:top w:val="single" w:sz="4" w:space="0" w:color="auto"/>
+              <w:left w:val="nil"/>
+              <w:bottom w:val="single" w:sz="4" w:space="0" w:color="auto"/>
+              <w:right w:val="nil"/>
+            </w:tcBorders>
+          </w:tcPr>
+          <w:p>
+            <w:pPr>
+              <w:pStyle w:val="paragraph"/>
+              <w:spacing w:before="0" w:beforeAutospacing="0" w:after="0" w:afterAutospacing="0"/>
+              <w:textAlignment w:val="baseline"/>
+              <w:rPr>
+                <w:rFonts w:asciiTheme="minorHAnsi" w:hAnsiTheme="minorHAnsi" w:cstheme="minorHAnsi"/>
+              </w:rPr>
+            </w:pPr>
+            <w:r>
+              <w:rPr>
+                <w:rFonts w:ascii="Arial" w:hAnsi="Arial" w:cs="Arial"/>
+                <w:sz w:val="16"/>
+                <w:szCs w:val="16"/>
+              </w:rPr>
+              <w:t>&lt;&lt;</w:t>
+            </w:r>
+            <w:r>
+              <w:rPr>
+                <w:rFonts w:ascii="Arial" w:hAnsi="Arial" w:cs="Arial"/>
+                <w:sz w:val="16"/>
+                <w:szCs w:val="16"/>
+              </w:rPr>
+              <w:t>er_</w:t>
+            </w:r>
+            <w:r>
+              <w:rPr>
+                <w:rFonts w:ascii="Arial" w:hAnsi="Arial" w:cs="Arial"/>
+                <w:sz w:val="16"/>
+                <w:szCs w:val="16"/>
+              </w:rPr>
+              <w:t>&gt;&gt;</w:t>
+            </w:r>
+          </w:p>
+        </w:tc>
+      </w:tr>
+      <w:tr>
+        <w:tc>
+          <w:tcPr>
+            <w:tcW w:w="9067" w:type="dxa"/>
+            <w:tcBorders>
+              <w:top w:val="single" w:sz="4" w:space="0" w:color="auto"/>
+              <w:left w:val="nil"/>
+              <w:bottom w:val="single" w:sz="4" w:space="0" w:color="auto"/>
+              <w:right w:val="nil"/>
+            </w:tcBorders>
+            <w:hideMark/>
+          </w:tcPr>
+          <w:p>
+            <w:pPr>
+              <w:pStyle w:val="paragraph"/>
+              <w:spacing w:before="0" w:beforeAutospacing="0" w:after="0" w:afterAutospacing="0"/>
+              <w:textAlignment w:val="baseline"/>
+              <w:rPr>
                 <w:rFonts w:asciiTheme="minorHAnsi" w:hAnsiTheme="minorHAnsi" w:cstheme="minorHAnsi"/>
                 <w:sz w:val="18"/>
                 <w:szCs w:val="18"/>
@@ -3527,25 +3670,7 @@
                 <w:color w:val="000000"/>
                 <w:lang w:eastAsia="en-US"/>
               </w:rPr>
-              <w:t>&lt;&lt;</w:t>
-            </w:r>
-            <w:r>
-              <w:rPr>
-                <w:rStyle w:val="normaltextrun"/>
-                <w:rFonts w:asciiTheme="minorHAnsi" w:hAnsiTheme="minorHAnsi" w:cstheme="minorHAnsi"/>
-                <w:color w:val="000000"/>
-                <w:lang w:eastAsia="en-US"/>
-              </w:rPr>
-              <w:t>date</w:t>
-            </w:r>
-            <w:r>
-              <w:rPr>
-                <w:rStyle w:val="normaltextrun"/>
-                <w:rFonts w:asciiTheme="minorHAnsi" w:hAnsiTheme="minorHAnsi" w:cstheme="minorHAnsi"/>
-                <w:color w:val="000000"/>
-                <w:lang w:eastAsia="en-US"/>
-              </w:rPr>
-              <w:t>&gt;&gt;</w:t>
+              <w:t>&lt;&lt;date&gt;&gt;</w:t>
             </w:r>
           </w:p>
         </w:tc>
@@ -5596,7 +5721,7 @@
       <w:tr>
         <w:tc>
           <w:tcPr>
-            <w:tcW w:w="3539" w:type="dxa"/>
+            <w:tcW w:w="3837" w:type="dxa"/>
             <w:tcBorders>
               <w:top w:val="single" w:sz="4" w:space="0" w:color="auto"/>
               <w:left w:val="nil"/>
@@ -5614,7 +5739,7 @@
         </w:tc>
         <w:tc>
           <w:tcPr>
-            <w:tcW w:w="5477" w:type="dxa"/>
+            <w:tcW w:w="5189" w:type="dxa"/>
             <w:tcBorders>
               <w:top w:val="single" w:sz="4" w:space="0" w:color="auto"/>
               <w:left w:val="nil"/>
@@ -5633,7 +5758,7 @@
       <w:tr>
         <w:tc>
           <w:tcPr>
-            <w:tcW w:w="3539" w:type="dxa"/>
+            <w:tcW w:w="3837" w:type="dxa"/>
             <w:tcBorders>
               <w:top w:val="single" w:sz="4" w:space="0" w:color="auto"/>
               <w:left w:val="nil"/>
@@ -5650,7 +5775,7 @@
         </w:tc>
         <w:tc>
           <w:tcPr>
-            <w:tcW w:w="5477" w:type="dxa"/>
+            <w:tcW w:w="5189" w:type="dxa"/>
             <w:tcBorders>
               <w:top w:val="single" w:sz="4" w:space="0" w:color="auto"/>
               <w:left w:val="nil"/>
@@ -5669,7 +5794,7 @@
       <w:tr>
         <w:tc>
           <w:tcPr>
-            <w:tcW w:w="3539" w:type="dxa"/>
+            <w:tcW w:w="3837" w:type="dxa"/>
             <w:tcBorders>
               <w:top w:val="single" w:sz="4" w:space="0" w:color="auto"/>
               <w:left w:val="nil"/>
@@ -5767,7 +5892,7 @@
         </w:tc>
         <w:tc>
           <w:tcPr>
-            <w:tcW w:w="5477" w:type="dxa"/>
+            <w:tcW w:w="5189" w:type="dxa"/>
             <w:tcBorders>
               <w:top w:val="single" w:sz="4" w:space="0" w:color="auto"/>
               <w:left w:val="nil"/>
@@ -5781,7 +5906,7 @@
       <w:tr>
         <w:tc>
           <w:tcPr>
-            <w:tcW w:w="3539" w:type="dxa"/>
+            <w:tcW w:w="3837" w:type="dxa"/>
             <w:tcBorders>
               <w:top w:val="single" w:sz="4" w:space="0" w:color="auto"/>
               <w:left w:val="nil"/>
@@ -5798,7 +5923,7 @@
         </w:tc>
         <w:tc>
           <w:tcPr>
-            <w:tcW w:w="5477" w:type="dxa"/>
+            <w:tcW w:w="5189" w:type="dxa"/>
             <w:tcBorders>
               <w:top w:val="single" w:sz="4" w:space="0" w:color="auto"/>
               <w:left w:val="nil"/>
@@ -5817,7 +5942,7 @@
       <w:tr>
         <w:tc>
           <w:tcPr>
-            <w:tcW w:w="3539" w:type="dxa"/>
+            <w:tcW w:w="3837" w:type="dxa"/>
             <w:tcBorders>
               <w:top w:val="single" w:sz="4" w:space="0" w:color="auto"/>
               <w:left w:val="nil"/>
@@ -5854,7 +5979,7 @@
         </w:tc>
         <w:tc>
           <w:tcPr>
-            <w:tcW w:w="5477" w:type="dxa"/>
+            <w:tcW w:w="5189" w:type="dxa"/>
             <w:tcBorders>
               <w:top w:val="single" w:sz="4" w:space="0" w:color="auto"/>
               <w:left w:val="nil"/>
@@ -5868,7 +5993,7 @@
       <w:tr>
         <w:tc>
           <w:tcPr>
-            <w:tcW w:w="3539" w:type="dxa"/>
+            <w:tcW w:w="3837" w:type="dxa"/>
             <w:tcBorders>
               <w:top w:val="single" w:sz="4" w:space="0" w:color="auto"/>
               <w:left w:val="nil"/>
@@ -5966,7 +6091,7 @@
         </w:tc>
         <w:tc>
           <w:tcPr>
-            <w:tcW w:w="5477" w:type="dxa"/>
+            <w:tcW w:w="5189" w:type="dxa"/>
             <w:tcBorders>
               <w:top w:val="single" w:sz="4" w:space="0" w:color="auto"/>
               <w:left w:val="nil"/>
@@ -5980,7 +6105,7 @@
       <w:tr>
         <w:tc>
           <w:tcPr>
-            <w:tcW w:w="3539" w:type="dxa"/>
+            <w:tcW w:w="3837" w:type="dxa"/>
             <w:tcBorders>
               <w:top w:val="single" w:sz="4" w:space="0" w:color="auto"/>
               <w:left w:val="nil"/>
@@ -5997,7 +6122,7 @@
         </w:tc>
         <w:tc>
           <w:tcPr>
-            <w:tcW w:w="5477" w:type="dxa"/>
+            <w:tcW w:w="5189" w:type="dxa"/>
             <w:tcBorders>
               <w:top w:val="single" w:sz="4" w:space="0" w:color="auto"/>
               <w:left w:val="nil"/>
@@ -6016,7 +6141,7 @@
       <w:tr>
         <w:tc>
           <w:tcPr>
-            <w:tcW w:w="3539" w:type="dxa"/>
+            <w:tcW w:w="3837" w:type="dxa"/>
             <w:tcBorders>
               <w:top w:val="single" w:sz="4" w:space="0" w:color="auto"/>
               <w:left w:val="nil"/>
@@ -6053,7 +6178,7 @@
         </w:tc>
         <w:tc>
           <w:tcPr>
-            <w:tcW w:w="5477" w:type="dxa"/>
+            <w:tcW w:w="5189" w:type="dxa"/>
             <w:tcBorders>
               <w:top w:val="single" w:sz="4" w:space="0" w:color="auto"/>
               <w:left w:val="nil"/>
@@ -6067,7 +6192,7 @@
       <w:tr>
         <w:tc>
           <w:tcPr>
-            <w:tcW w:w="3539" w:type="dxa"/>
+            <w:tcW w:w="3837" w:type="dxa"/>
             <w:tcBorders>
               <w:top w:val="single" w:sz="4" w:space="0" w:color="auto"/>
               <w:left w:val="nil"/>
@@ -6180,7 +6305,7 @@
         </w:tc>
         <w:tc>
           <w:tcPr>
-            <w:tcW w:w="5477" w:type="dxa"/>
+            <w:tcW w:w="5189" w:type="dxa"/>
             <w:tcBorders>
               <w:top w:val="single" w:sz="4" w:space="0" w:color="auto"/>
               <w:left w:val="nil"/>
@@ -6194,7 +6319,7 @@
       <w:tr>
         <w:tc>
           <w:tcPr>
-            <w:tcW w:w="3539" w:type="dxa"/>
+            <w:tcW w:w="3837" w:type="dxa"/>
             <w:tcBorders>
               <w:top w:val="single" w:sz="4" w:space="0" w:color="auto"/>
               <w:left w:val="nil"/>
@@ -6211,7 +6336,7 @@
         </w:tc>
         <w:tc>
           <w:tcPr>
-            <w:tcW w:w="5477" w:type="dxa"/>
+            <w:tcW w:w="5189" w:type="dxa"/>
             <w:tcBorders>
               <w:top w:val="single" w:sz="4" w:space="0" w:color="auto"/>
               <w:left w:val="nil"/>
@@ -6230,7 +6355,7 @@
       <w:tr>
         <w:tc>
           <w:tcPr>
-            <w:tcW w:w="3539" w:type="dxa"/>
+            <w:tcW w:w="3837" w:type="dxa"/>
             <w:tcBorders>
               <w:top w:val="single" w:sz="4" w:space="0" w:color="auto"/>
               <w:left w:val="nil"/>
@@ -6267,7 +6392,7 @@
         </w:tc>
         <w:tc>
           <w:tcPr>
-            <w:tcW w:w="5477" w:type="dxa"/>
+            <w:tcW w:w="5189" w:type="dxa"/>
             <w:tcBorders>
               <w:top w:val="single" w:sz="4" w:space="0" w:color="auto"/>
               <w:left w:val="nil"/>
@@ -6279,6 +6404,339 @@
         </w:tc>
       </w:tr>
     </w:tbl>
+    <w:p/>
+    <w:p>
+      <w:pPr>
+        <w:rPr>
+          <w:rFonts w:cstheme="minorHAnsi"/>
+          <w:b/>
+          <w:bCs/>
+        </w:rPr>
+      </w:pPr>
+      <w:r>
+        <w:t>&lt;&lt;c</w:t>
+      </w:r>
+      <w:r>
+        <w:t>s</w:t>
+      </w:r>
+      <w:r>
+        <w:t>_{</w:t>
+      </w:r>
+      <w:proofErr w:type="spellStart"/>
+      <w:proofErr w:type="gramStart"/>
+      <w:r>
+        <w:t>responseSotName</w:t>
+      </w:r>
+      <w:proofErr w:type="spellEnd"/>
+      <w:r>
+        <w:t>!=</w:t>
+      </w:r>
+      <w:proofErr w:type="gramEnd"/>
+      <w:r>
+        <w:t>null}&gt;&gt;</w:t>
+      </w:r>
+      <w:r>
+        <w:rPr>
+          <w:rFonts w:cstheme="minorHAnsi"/>
+          <w:b/>
+          <w:bCs/>
+        </w:rPr>
+        <w:t>Statement of truth</w:t>
+      </w:r>
+    </w:p>
+    <w:p>
+      <w:pPr>
+        <w:rPr>
+          <w:rFonts w:cstheme="minorHAnsi"/>
+        </w:rPr>
+      </w:pPr>
+    </w:p>
+    <w:tbl>
+      <w:tblPr>
+        <w:tblStyle w:val="TableGrid"/>
+        <w:tblW w:w="9067" w:type="dxa"/>
+        <w:tblInd w:w="0" w:type="dxa"/>
+        <w:tblBorders>
+          <w:left w:val="none" w:sz="0" w:space="0" w:color="auto"/>
+          <w:right w:val="none" w:sz="0" w:space="0" w:color="auto"/>
+        </w:tblBorders>
+        <w:tblLook w:val="04A0" w:firstRow="1" w:lastRow="0" w:firstColumn="1" w:lastColumn="0" w:noHBand="0" w:noVBand="1"/>
+      </w:tblPr>
+      <w:tblGrid>
+        <w:gridCol w:w="9067"/>
+      </w:tblGrid>
+      <w:tr>
+        <w:tc>
+          <w:tcPr>
+            <w:tcW w:w="9067" w:type="dxa"/>
+            <w:tcBorders>
+              <w:top w:val="single" w:sz="4" w:space="0" w:color="auto"/>
+              <w:left w:val="nil"/>
+              <w:bottom w:val="single" w:sz="4" w:space="0" w:color="auto"/>
+              <w:right w:val="nil"/>
+            </w:tcBorders>
+            <w:hideMark/>
+          </w:tcPr>
+          <w:p>
+            <w:pPr>
+              <w:rPr>
+                <w:kern w:val="0"/>
+                <w14:ligatures w14:val="none"/>
+              </w:rPr>
+            </w:pPr>
+            <w:r>
+              <w:t>I believe the facts stated in this response are true. I understand that proceedings for contempt of court may be brought against anyone who makes, or causes to be made, a false statement in a document verified by a statement of truth without an honest belief in its truth.  </w:t>
+            </w:r>
+          </w:p>
+          <w:p/>
+        </w:tc>
+      </w:tr>
+      <w:tr>
+        <w:tc>
+          <w:tcPr>
+            <w:tcW w:w="9067" w:type="dxa"/>
+            <w:tcBorders>
+              <w:top w:val="single" w:sz="4" w:space="0" w:color="auto"/>
+              <w:left w:val="nil"/>
+              <w:bottom w:val="single" w:sz="4" w:space="0" w:color="auto"/>
+              <w:right w:val="nil"/>
+            </w:tcBorders>
+          </w:tcPr>
+          <w:p>
+            <w:r>
+              <w:rPr>
+                <w:rStyle w:val="normaltextrun"/>
+                <w:rFonts w:cstheme="minorHAnsi"/>
+                <w:color w:val="000000"/>
+              </w:rPr>
+              <w:t>&lt;&lt;</w:t>
+            </w:r>
+            <w:r>
+              <w:rPr>
+                <w:color w:val="080808"/>
+              </w:rPr>
+              <w:t xml:space="preserve"> </w:t>
+            </w:r>
+            <w:proofErr w:type="spellStart"/>
+            <w:r>
+              <w:rPr>
+                <w:rFonts w:cstheme="minorHAnsi"/>
+                <w:color w:val="000000"/>
+              </w:rPr>
+              <w:t>responseSotName</w:t>
+            </w:r>
+            <w:proofErr w:type="spellEnd"/>
+            <w:r>
+              <w:rPr>
+                <w:rStyle w:val="normaltextrun"/>
+                <w:rFonts w:cstheme="minorHAnsi"/>
+                <w:color w:val="000000"/>
+              </w:rPr>
+              <w:t>&gt;&gt;</w:t>
+            </w:r>
+          </w:p>
+        </w:tc>
+      </w:tr>
+      <w:tr>
+        <w:tc>
+          <w:tcPr>
+            <w:tcW w:w="9067" w:type="dxa"/>
+            <w:tcBorders>
+              <w:top w:val="single" w:sz="4" w:space="0" w:color="auto"/>
+              <w:left w:val="nil"/>
+              <w:bottom w:val="single" w:sz="4" w:space="0" w:color="auto"/>
+              <w:right w:val="nil"/>
+            </w:tcBorders>
+          </w:tcPr>
+          <w:p>
+            <w:r>
+              <w:rPr>
+                <w:rFonts w:ascii="Arial" w:hAnsi="Arial" w:cs="Arial"/>
+                <w:sz w:val="16"/>
+                <w:szCs w:val="16"/>
+              </w:rPr>
+              <w:t>&lt;&lt;</w:t>
+            </w:r>
+            <w:proofErr w:type="spellStart"/>
+            <w:r>
+              <w:rPr>
+                <w:rFonts w:ascii="Arial" w:hAnsi="Arial" w:cs="Arial"/>
+                <w:sz w:val="16"/>
+                <w:szCs w:val="16"/>
+              </w:rPr>
+              <w:t>cr</w:t>
+            </w:r>
+            <w:proofErr w:type="spellEnd"/>
+            <w:proofErr w:type="gramStart"/>
+            <w:r>
+              <w:rPr>
+                <w:rFonts w:ascii="Arial" w:hAnsi="Arial" w:cs="Arial"/>
+                <w:sz w:val="16"/>
+                <w:szCs w:val="16"/>
+              </w:rPr>
+              <w:t>_{</w:t>
+            </w:r>
+            <w:r>
+              <w:rPr>
+                <w:color w:val="080808"/>
+              </w:rPr>
+              <w:t xml:space="preserve"> </w:t>
+            </w:r>
+            <w:proofErr w:type="spellStart"/>
+            <w:r>
+              <w:rPr>
+                <w:rFonts w:ascii="Arial" w:hAnsi="Arial" w:cs="Arial"/>
+                <w:sz w:val="16"/>
+                <w:szCs w:val="16"/>
+              </w:rPr>
+              <w:t>responseSotRole</w:t>
+            </w:r>
+            <w:proofErr w:type="spellEnd"/>
+            <w:proofErr w:type="gramEnd"/>
+            <w:r>
+              <w:rPr>
+                <w:rFonts w:ascii="Arial" w:hAnsi="Arial" w:cs="Arial"/>
+                <w:sz w:val="16"/>
+                <w:szCs w:val="16"/>
+              </w:rPr>
+              <w:t>!=null}&gt;&gt;</w:t>
+            </w:r>
+          </w:p>
+        </w:tc>
+      </w:tr>
+      <w:tr>
+        <w:tc>
+          <w:tcPr>
+            <w:tcW w:w="9067" w:type="dxa"/>
+            <w:tcBorders>
+              <w:top w:val="single" w:sz="4" w:space="0" w:color="auto"/>
+              <w:left w:val="nil"/>
+              <w:bottom w:val="single" w:sz="4" w:space="0" w:color="auto"/>
+              <w:right w:val="nil"/>
+            </w:tcBorders>
+          </w:tcPr>
+          <w:p>
+            <w:r>
+              <w:rPr>
+                <w:rFonts w:cstheme="minorHAnsi"/>
+              </w:rPr>
+              <w:t>&lt;&lt;</w:t>
+            </w:r>
+            <w:r>
+              <w:rPr>
+                <w:color w:val="080808"/>
+              </w:rPr>
+              <w:t xml:space="preserve"> </w:t>
+            </w:r>
+            <w:proofErr w:type="spellStart"/>
+            <w:r>
+              <w:rPr>
+                <w:rFonts w:cstheme="minorHAnsi"/>
+              </w:rPr>
+              <w:t>responseSotRole</w:t>
+            </w:r>
+            <w:proofErr w:type="spellEnd"/>
+            <w:r>
+              <w:rPr>
+                <w:rFonts w:cstheme="minorHAnsi"/>
+              </w:rPr>
+              <w:t>&gt;&gt;</w:t>
+            </w:r>
+          </w:p>
+        </w:tc>
+      </w:tr>
+      <w:tr>
+        <w:tc>
+          <w:tcPr>
+            <w:tcW w:w="9067" w:type="dxa"/>
+            <w:tcBorders>
+              <w:top w:val="single" w:sz="4" w:space="0" w:color="auto"/>
+              <w:left w:val="nil"/>
+              <w:bottom w:val="single" w:sz="4" w:space="0" w:color="auto"/>
+              <w:right w:val="nil"/>
+            </w:tcBorders>
+          </w:tcPr>
+          <w:p>
+            <w:pPr>
+              <w:rPr>
+                <w:rFonts w:cstheme="minorHAnsi"/>
+              </w:rPr>
+            </w:pPr>
+            <w:r>
+              <w:rPr>
+                <w:rFonts w:ascii="Arial" w:hAnsi="Arial" w:cs="Arial"/>
+                <w:sz w:val="16"/>
+                <w:szCs w:val="16"/>
+              </w:rPr>
+              <w:t>&lt;&lt;</w:t>
+            </w:r>
+            <w:r>
+              <w:rPr>
+                <w:rFonts w:ascii="Arial" w:hAnsi="Arial" w:cs="Arial"/>
+                <w:sz w:val="16"/>
+                <w:szCs w:val="16"/>
+              </w:rPr>
+              <w:t>er_</w:t>
+            </w:r>
+            <w:r>
+              <w:rPr>
+                <w:rFonts w:ascii="Arial" w:hAnsi="Arial" w:cs="Arial"/>
+                <w:sz w:val="16"/>
+                <w:szCs w:val="16"/>
+              </w:rPr>
+              <w:t>&gt;&gt;</w:t>
+            </w:r>
+          </w:p>
+        </w:tc>
+      </w:tr>
+      <w:tr>
+        <w:tc>
+          <w:tcPr>
+            <w:tcW w:w="9067" w:type="dxa"/>
+            <w:tcBorders>
+              <w:top w:val="single" w:sz="4" w:space="0" w:color="auto"/>
+              <w:left w:val="nil"/>
+              <w:bottom w:val="single" w:sz="4" w:space="0" w:color="auto"/>
+              <w:right w:val="nil"/>
+            </w:tcBorders>
+          </w:tcPr>
+          <w:p>
+            <w:pPr>
+              <w:rPr>
+                <w:rFonts w:ascii="Arial" w:hAnsi="Arial" w:cs="Arial"/>
+                <w:sz w:val="16"/>
+                <w:szCs w:val="16"/>
+              </w:rPr>
+            </w:pPr>
+            <w:r>
+              <w:rPr>
+                <w:rStyle w:val="normaltextrun"/>
+                <w:rFonts w:cstheme="minorHAnsi"/>
+                <w:color w:val="000000"/>
+              </w:rPr>
+              <w:t>&lt;&lt;date&gt;&gt;</w:t>
+            </w:r>
+          </w:p>
+        </w:tc>
+      </w:tr>
+    </w:tbl>
+    <w:p>
+      <w:pPr>
+        <w:rPr>
+          <w:rFonts w:ascii="Arial" w:hAnsi="Arial" w:cs="Arial"/>
+          <w:sz w:val="16"/>
+          <w:szCs w:val="16"/>
+        </w:rPr>
+      </w:pPr>
+      <w:r>
+        <w:rPr>
+          <w:rFonts w:ascii="Arial" w:hAnsi="Arial" w:cs="Arial"/>
+          <w:sz w:val="16"/>
+          <w:szCs w:val="16"/>
+        </w:rPr>
+        <w:t>&lt;&lt;es_ &gt;&gt;</w:t>
+      </w:r>
+    </w:p>
     <w:p>
       <w:pPr>
         <w:rPr>
@@ -6968,6 +7426,7 @@
                 <w:sz w:val="16"/>
                 <w:szCs w:val="16"/>
               </w:rPr>
+              <w:lastRenderedPageBreak/>
               <w:t>&lt;&lt;</w:t>
             </w:r>
             <w:proofErr w:type="spellStart"/>
@@ -7366,7 +7825,6 @@
           </w:tcPr>
           <w:p>
             <w:r>
-              <w:lastRenderedPageBreak/>
               <w:t>Preferred location</w:t>
             </w:r>
           </w:p>
@@ -8891,6 +9349,7 @@
           </w:tcPr>
           <w:p>
             <w:r>
+              <w:lastRenderedPageBreak/>
               <w:t>What other support do you need?</w:t>
             </w:r>
           </w:p>
@@ -9004,7 +9463,7 @@
 </file>
 
 <file path=word/endnotes.xml><?xml version="1.0" encoding="utf-8"?>
-<w:endnotes xmlns:wpc="http://schemas.microsoft.com/office/word/2010/wordprocessingCanvas" xmlns:cx="http://schemas.microsoft.com/office/drawing/2014/chartex" xmlns:cx1="http://schemas.microsoft.com/office/drawing/2015/9/8/chartex" xmlns:cx2="http://schemas.microsoft.com/office/drawing/2015/10/21/chartex" xmlns:cx3="http://schemas.microsoft.com/office/drawing/2016/5/9/chartex" xmlns:cx4="http://schemas.microsoft.com/office/drawing/2016/5/10/chartex" xmlns:cx5="http://schemas.microsoft.com/office/drawing/2016/5/11/chartex" xmlns:cx6="http://schemas.microsoft.com/office/drawing/2016/5/12/chartex" xmlns:cx7="http://schemas.microsoft.com/office/drawing/2016/5/13/chartex" xmlns:cx8="http://schemas.microsoft.com/office/drawing/2016/5/14/chartex" xmlns:mc="http://schemas.openxmlformats.org/markup-compatibility/2006" xmlns:aink="http://schemas.microsoft.com/office/drawing/2016/ink" xmlns:am3d="http://schemas.microsoft.com/office/drawing/2017/model3d" xmlns:o="urn:schemas-microsoft-com:office:office" xmlns:oel="http://schemas.microsoft.com/office/2019/extlst" xmlns:r="http://schemas.openxmlformats.org/officeDocument/2006/relationships" xmlns:m="http://schemas.openxmlformats.org/officeDocument/2006/math" xmlns:v="urn:schemas-microsoft-com:vml" xmlns:wp14="http://schemas.microsoft.com/office/word/2010/wordprocessingDrawing" xmlns:wp="http://schemas.openxmlformats.org/drawingml/2006/wordprocessingDrawing" xmlns:w10="urn:schemas-microsoft-com:office:word" xmlns:w="http://schemas.openxmlformats.org/wordprocessingml/2006/main" xmlns:w14="http://schemas.microsoft.com/office/word/2010/wordml" xmlns:w15="http://schemas.microsoft.com/office/word/2012/wordml" xmlns:w16cex="http://schemas.microsoft.com/office/word/2018/wordml/cex" xmlns:w16cid="http://schemas.microsoft.com/office/word/2016/wordml/cid" xmlns:w16="http://schemas.microsoft.com/office/word/2018/wordml" xmlns:w16du="http://schemas.microsoft.com/office/word/2023/wordml/word16du" xmlns:w16sdtdh="http://schemas.microsoft.com/office/word/2020/wordml/sdtdatahash" xmlns:w16se="http://schemas.microsoft.com/office/word/2015/wordml/symex" xmlns:wpg="http://schemas.microsoft.com/office/word/2010/wordprocessingGroup" xmlns:wpi="http://schemas.microsoft.com/office/word/2010/wordprocessingInk" xmlns:wne="http://schemas.microsoft.com/office/word/2006/wordml" xmlns:wps="http://schemas.microsoft.com/office/word/2010/wordprocessingShape" mc:Ignorable="w14 w15 w16se w16cid w16 w16cex w16sdtdh w16du wp14">
+<w:endnotes xmlns:wpc="http://schemas.microsoft.com/office/word/2010/wordprocessingCanvas" xmlns:cx="http://schemas.microsoft.com/office/drawing/2014/chartex" xmlns:cx1="http://schemas.microsoft.com/office/drawing/2015/9/8/chartex" xmlns:cx2="http://schemas.microsoft.com/office/drawing/2015/10/21/chartex" xmlns:cx3="http://schemas.microsoft.com/office/drawing/2016/5/9/chartex" xmlns:cx4="http://schemas.microsoft.com/office/drawing/2016/5/10/chartex" xmlns:cx5="http://schemas.microsoft.com/office/drawing/2016/5/11/chartex" xmlns:cx6="http://schemas.microsoft.com/office/drawing/2016/5/12/chartex" xmlns:cx7="http://schemas.microsoft.com/office/drawing/2016/5/13/chartex" xmlns:cx8="http://schemas.microsoft.com/office/drawing/2016/5/14/chartex" xmlns:mc="http://schemas.openxmlformats.org/markup-compatibility/2006" xmlns:aink="http://schemas.microsoft.com/office/drawing/2016/ink" xmlns:am3d="http://schemas.microsoft.com/office/drawing/2017/model3d" xmlns:o="urn:schemas-microsoft-com:office:office" xmlns:oel="http://schemas.microsoft.com/office/2019/extlst" xmlns:r="http://schemas.openxmlformats.org/officeDocument/2006/relationships" xmlns:m="http://schemas.openxmlformats.org/officeDocument/2006/math" xmlns:v="urn:schemas-microsoft-com:vml" xmlns:wp14="http://schemas.microsoft.com/office/word/2010/wordprocessingDrawing" xmlns:wp="http://schemas.openxmlformats.org/drawingml/2006/wordprocessingDrawing" xmlns:w10="urn:schemas-microsoft-com:office:word" xmlns:w="http://schemas.openxmlformats.org/wordprocessingml/2006/main" xmlns:w14="http://schemas.microsoft.com/office/word/2010/wordml" xmlns:w15="http://schemas.microsoft.com/office/word/2012/wordml" xmlns:w16cex="http://schemas.microsoft.com/office/word/2018/wordml/cex" xmlns:w16cid="http://schemas.microsoft.com/office/word/2016/wordml/cid" xmlns:w16="http://schemas.microsoft.com/office/word/2018/wordml" xmlns:w16du="http://schemas.microsoft.com/office/word/2023/wordml/word16du" xmlns:w16sdtdh="http://schemas.microsoft.com/office/word/2020/wordml/sdtdatahash" xmlns:w16sdtfl="http://schemas.microsoft.com/office/word/2024/wordml/sdtformatlock" xmlns:w16se="http://schemas.microsoft.com/office/word/2015/wordml/symex" xmlns:wpg="http://schemas.microsoft.com/office/word/2010/wordprocessingGroup" xmlns:wpi="http://schemas.microsoft.com/office/word/2010/wordprocessingInk" xmlns:wne="http://schemas.microsoft.com/office/word/2006/wordml" xmlns:wps="http://schemas.microsoft.com/office/word/2010/wordprocessingShape" mc:Ignorable="w14 w15 w16se w16cid w16 w16cex w16sdtdh w16sdtfl w16du wp14">
   <w:endnote w:type="separator" w:id="-1">
     <w:p>
       <w:r>
@@ -9023,7 +9482,7 @@
 </file>
 
 <file path=word/footer1.xml><?xml version="1.0" encoding="utf-8"?>
-<w:ftr xmlns:wpc="http://schemas.microsoft.com/office/word/2010/wordprocessingCanvas" xmlns:cx="http://schemas.microsoft.com/office/drawing/2014/chartex" xmlns:cx1="http://schemas.microsoft.com/office/drawing/2015/9/8/chartex" xmlns:cx2="http://schemas.microsoft.com/office/drawing/2015/10/21/chartex" xmlns:cx3="http://schemas.microsoft.com/office/drawing/2016/5/9/chartex" xmlns:cx4="http://schemas.microsoft.com/office/drawing/2016/5/10/chartex" xmlns:cx5="http://schemas.microsoft.com/office/drawing/2016/5/11/chartex" xmlns:cx6="http://schemas.microsoft.com/office/drawing/2016/5/12/chartex" xmlns:cx7="http://schemas.microsoft.com/office/drawing/2016/5/13/chartex" xmlns:cx8="http://schemas.microsoft.com/office/drawing/2016/5/14/chartex" xmlns:mc="http://schemas.openxmlformats.org/markup-compatibility/2006" xmlns:aink="http://schemas.microsoft.com/office/drawing/2016/ink" xmlns:am3d="http://schemas.microsoft.com/office/drawing/2017/model3d" xmlns:o="urn:schemas-microsoft-com:office:office" xmlns:oel="http://schemas.microsoft.com/office/2019/extlst" xmlns:r="http://schemas.openxmlformats.org/officeDocument/2006/relationships" xmlns:m="http://schemas.openxmlformats.org/officeDocument/2006/math" xmlns:v="urn:schemas-microsoft-com:vml" xmlns:wp14="http://schemas.microsoft.com/office/word/2010/wordprocessingDrawing" xmlns:wp="http://schemas.openxmlformats.org/drawingml/2006/wordprocessingDrawing" xmlns:w10="urn:schemas-microsoft-com:office:word" xmlns:w="http://schemas.openxmlformats.org/wordprocessingml/2006/main" xmlns:w14="http://schemas.microsoft.com/office/word/2010/wordml" xmlns:w15="http://schemas.microsoft.com/office/word/2012/wordml" xmlns:w16cex="http://schemas.microsoft.com/office/word/2018/wordml/cex" xmlns:w16cid="http://schemas.microsoft.com/office/word/2016/wordml/cid" xmlns:w16="http://schemas.microsoft.com/office/word/2018/wordml" xmlns:w16du="http://schemas.microsoft.com/office/word/2023/wordml/word16du" xmlns:w16sdtdh="http://schemas.microsoft.com/office/word/2020/wordml/sdtdatahash" xmlns:w16se="http://schemas.microsoft.com/office/word/2015/wordml/symex" xmlns:wpg="http://schemas.microsoft.com/office/word/2010/wordprocessingGroup" xmlns:wpi="http://schemas.microsoft.com/office/word/2010/wordprocessingInk" xmlns:wne="http://schemas.microsoft.com/office/word/2006/wordml" xmlns:wps="http://schemas.microsoft.com/office/word/2010/wordprocessingShape" mc:Ignorable="w14 w15 w16se w16cid w16 w16cex w16sdtdh w16du wp14">
+<w:ftr xmlns:wpc="http://schemas.microsoft.com/office/word/2010/wordprocessingCanvas" xmlns:cx="http://schemas.microsoft.com/office/drawing/2014/chartex" xmlns:cx1="http://schemas.microsoft.com/office/drawing/2015/9/8/chartex" xmlns:cx2="http://schemas.microsoft.com/office/drawing/2015/10/21/chartex" xmlns:cx3="http://schemas.microsoft.com/office/drawing/2016/5/9/chartex" xmlns:cx4="http://schemas.microsoft.com/office/drawing/2016/5/10/chartex" xmlns:cx5="http://schemas.microsoft.com/office/drawing/2016/5/11/chartex" xmlns:cx6="http://schemas.microsoft.com/office/drawing/2016/5/12/chartex" xmlns:cx7="http://schemas.microsoft.com/office/drawing/2016/5/13/chartex" xmlns:cx8="http://schemas.microsoft.com/office/drawing/2016/5/14/chartex" xmlns:mc="http://schemas.openxmlformats.org/markup-compatibility/2006" xmlns:aink="http://schemas.microsoft.com/office/drawing/2016/ink" xmlns:am3d="http://schemas.microsoft.com/office/drawing/2017/model3d" xmlns:o="urn:schemas-microsoft-com:office:office" xmlns:oel="http://schemas.microsoft.com/office/2019/extlst" xmlns:r="http://schemas.openxmlformats.org/officeDocument/2006/relationships" xmlns:m="http://schemas.openxmlformats.org/officeDocument/2006/math" xmlns:v="urn:schemas-microsoft-com:vml" xmlns:wp14="http://schemas.microsoft.com/office/word/2010/wordprocessingDrawing" xmlns:wp="http://schemas.openxmlformats.org/drawingml/2006/wordprocessingDrawing" xmlns:w10="urn:schemas-microsoft-com:office:word" xmlns:w="http://schemas.openxmlformats.org/wordprocessingml/2006/main" xmlns:w14="http://schemas.microsoft.com/office/word/2010/wordml" xmlns:w15="http://schemas.microsoft.com/office/word/2012/wordml" xmlns:w16cex="http://schemas.microsoft.com/office/word/2018/wordml/cex" xmlns:w16cid="http://schemas.microsoft.com/office/word/2016/wordml/cid" xmlns:w16="http://schemas.microsoft.com/office/word/2018/wordml" xmlns:w16du="http://schemas.microsoft.com/office/word/2023/wordml/word16du" xmlns:w16sdtdh="http://schemas.microsoft.com/office/word/2020/wordml/sdtdatahash" xmlns:w16sdtfl="http://schemas.microsoft.com/office/word/2024/wordml/sdtformatlock" xmlns:w16se="http://schemas.microsoft.com/office/word/2015/wordml/symex" xmlns:wpg="http://schemas.microsoft.com/office/word/2010/wordprocessingGroup" xmlns:wpi="http://schemas.microsoft.com/office/word/2010/wordprocessingInk" xmlns:wne="http://schemas.microsoft.com/office/word/2006/wordml" xmlns:wps="http://schemas.microsoft.com/office/word/2010/wordprocessingShape" mc:Ignorable="w14 w15 w16se w16cid w16 w16cex w16sdtdh w16sdtfl w16du wp14">
   <w:p>
     <w:pPr>
       <w:pStyle w:val="Footer"/>
@@ -9033,7 +9492,7 @@
 </file>
 
 <file path=word/footer2.xml><?xml version="1.0" encoding="utf-8"?>
-<w:ftr xmlns:wpc="http://schemas.microsoft.com/office/word/2010/wordprocessingCanvas" xmlns:cx="http://schemas.microsoft.com/office/drawing/2014/chartex" xmlns:cx1="http://schemas.microsoft.com/office/drawing/2015/9/8/chartex" xmlns:cx2="http://schemas.microsoft.com/office/drawing/2015/10/21/chartex" xmlns:cx3="http://schemas.microsoft.com/office/drawing/2016/5/9/chartex" xmlns:cx4="http://schemas.microsoft.com/office/drawing/2016/5/10/chartex" xmlns:cx5="http://schemas.microsoft.com/office/drawing/2016/5/11/chartex" xmlns:cx6="http://schemas.microsoft.com/office/drawing/2016/5/12/chartex" xmlns:cx7="http://schemas.microsoft.com/office/drawing/2016/5/13/chartex" xmlns:cx8="http://schemas.microsoft.com/office/drawing/2016/5/14/chartex" xmlns:mc="http://schemas.openxmlformats.org/markup-compatibility/2006" xmlns:aink="http://schemas.microsoft.com/office/drawing/2016/ink" xmlns:am3d="http://schemas.microsoft.com/office/drawing/2017/model3d" xmlns:o="urn:schemas-microsoft-com:office:office" xmlns:oel="http://schemas.microsoft.com/office/2019/extlst" xmlns:r="http://schemas.openxmlformats.org/officeDocument/2006/relationships" xmlns:m="http://schemas.openxmlformats.org/officeDocument/2006/math" xmlns:v="urn:schemas-microsoft-com:vml" xmlns:wp14="http://schemas.microsoft.com/office/word/2010/wordprocessingDrawing" xmlns:wp="http://schemas.openxmlformats.org/drawingml/2006/wordprocessingDrawing" xmlns:w10="urn:schemas-microsoft-com:office:word" xmlns:w="http://schemas.openxmlformats.org/wordprocessingml/2006/main" xmlns:w14="http://schemas.microsoft.com/office/word/2010/wordml" xmlns:w15="http://schemas.microsoft.com/office/word/2012/wordml" xmlns:w16cex="http://schemas.microsoft.com/office/word/2018/wordml/cex" xmlns:w16cid="http://schemas.microsoft.com/office/word/2016/wordml/cid" xmlns:w16="http://schemas.microsoft.com/office/word/2018/wordml" xmlns:w16du="http://schemas.microsoft.com/office/word/2023/wordml/word16du" xmlns:w16sdtdh="http://schemas.microsoft.com/office/word/2020/wordml/sdtdatahash" xmlns:w16se="http://schemas.microsoft.com/office/word/2015/wordml/symex" xmlns:wpg="http://schemas.microsoft.com/office/word/2010/wordprocessingGroup" xmlns:wpi="http://schemas.microsoft.com/office/word/2010/wordprocessingInk" xmlns:wne="http://schemas.microsoft.com/office/word/2006/wordml" xmlns:wps="http://schemas.microsoft.com/office/word/2010/wordprocessingShape" mc:Ignorable="w14 w15 w16se w16cid w16 w16cex w16sdtdh w16du wp14">
+<w:ftr xmlns:wpc="http://schemas.microsoft.com/office/word/2010/wordprocessingCanvas" xmlns:cx="http://schemas.microsoft.com/office/drawing/2014/chartex" xmlns:cx1="http://schemas.microsoft.com/office/drawing/2015/9/8/chartex" xmlns:cx2="http://schemas.microsoft.com/office/drawing/2015/10/21/chartex" xmlns:cx3="http://schemas.microsoft.com/office/drawing/2016/5/9/chartex" xmlns:cx4="http://schemas.microsoft.com/office/drawing/2016/5/10/chartex" xmlns:cx5="http://schemas.microsoft.com/office/drawing/2016/5/11/chartex" xmlns:cx6="http://schemas.microsoft.com/office/drawing/2016/5/12/chartex" xmlns:cx7="http://schemas.microsoft.com/office/drawing/2016/5/13/chartex" xmlns:cx8="http://schemas.microsoft.com/office/drawing/2016/5/14/chartex" xmlns:mc="http://schemas.openxmlformats.org/markup-compatibility/2006" xmlns:aink="http://schemas.microsoft.com/office/drawing/2016/ink" xmlns:am3d="http://schemas.microsoft.com/office/drawing/2017/model3d" xmlns:o="urn:schemas-microsoft-com:office:office" xmlns:oel="http://schemas.microsoft.com/office/2019/extlst" xmlns:r="http://schemas.openxmlformats.org/officeDocument/2006/relationships" xmlns:m="http://schemas.openxmlformats.org/officeDocument/2006/math" xmlns:v="urn:schemas-microsoft-com:vml" xmlns:wp14="http://schemas.microsoft.com/office/word/2010/wordprocessingDrawing" xmlns:wp="http://schemas.openxmlformats.org/drawingml/2006/wordprocessingDrawing" xmlns:w10="urn:schemas-microsoft-com:office:word" xmlns:w="http://schemas.openxmlformats.org/wordprocessingml/2006/main" xmlns:w14="http://schemas.microsoft.com/office/word/2010/wordml" xmlns:w15="http://schemas.microsoft.com/office/word/2012/wordml" xmlns:w16cex="http://schemas.microsoft.com/office/word/2018/wordml/cex" xmlns:w16cid="http://schemas.microsoft.com/office/word/2016/wordml/cid" xmlns:w16="http://schemas.microsoft.com/office/word/2018/wordml" xmlns:w16du="http://schemas.microsoft.com/office/word/2023/wordml/word16du" xmlns:w16sdtdh="http://schemas.microsoft.com/office/word/2020/wordml/sdtdatahash" xmlns:w16sdtfl="http://schemas.microsoft.com/office/word/2024/wordml/sdtformatlock" xmlns:w16se="http://schemas.microsoft.com/office/word/2015/wordml/symex" xmlns:wpg="http://schemas.microsoft.com/office/word/2010/wordprocessingGroup" xmlns:wpi="http://schemas.microsoft.com/office/word/2010/wordprocessingInk" xmlns:wne="http://schemas.microsoft.com/office/word/2006/wordml" xmlns:wps="http://schemas.microsoft.com/office/word/2010/wordprocessingShape" mc:Ignorable="w14 w15 w16se w16cid w16 w16cex w16sdtdh w16sdtfl w16du wp14">
   <w:p>
     <w:pPr>
       <w:pStyle w:val="Footer"/>
@@ -9043,7 +9502,7 @@
 </file>
 
 <file path=word/footer3.xml><?xml version="1.0" encoding="utf-8"?>
-<w:ftr xmlns:wpc="http://schemas.microsoft.com/office/word/2010/wordprocessingCanvas" xmlns:cx="http://schemas.microsoft.com/office/drawing/2014/chartex" xmlns:cx1="http://schemas.microsoft.com/office/drawing/2015/9/8/chartex" xmlns:cx2="http://schemas.microsoft.com/office/drawing/2015/10/21/chartex" xmlns:cx3="http://schemas.microsoft.com/office/drawing/2016/5/9/chartex" xmlns:cx4="http://schemas.microsoft.com/office/drawing/2016/5/10/chartex" xmlns:cx5="http://schemas.microsoft.com/office/drawing/2016/5/11/chartex" xmlns:cx6="http://schemas.microsoft.com/office/drawing/2016/5/12/chartex" xmlns:cx7="http://schemas.microsoft.com/office/drawing/2016/5/13/chartex" xmlns:cx8="http://schemas.microsoft.com/office/drawing/2016/5/14/chartex" xmlns:mc="http://schemas.openxmlformats.org/markup-compatibility/2006" xmlns:aink="http://schemas.microsoft.com/office/drawing/2016/ink" xmlns:am3d="http://schemas.microsoft.com/office/drawing/2017/model3d" xmlns:o="urn:schemas-microsoft-com:office:office" xmlns:oel="http://schemas.microsoft.com/office/2019/extlst" xmlns:r="http://schemas.openxmlformats.org/officeDocument/2006/relationships" xmlns:m="http://schemas.openxmlformats.org/officeDocument/2006/math" xmlns:v="urn:schemas-microsoft-com:vml" xmlns:wp14="http://schemas.microsoft.com/office/word/2010/wordprocessingDrawing" xmlns:wp="http://schemas.openxmlformats.org/drawingml/2006/wordprocessingDrawing" xmlns:w10="urn:schemas-microsoft-com:office:word" xmlns:w="http://schemas.openxmlformats.org/wordprocessingml/2006/main" xmlns:w14="http://schemas.microsoft.com/office/word/2010/wordml" xmlns:w15="http://schemas.microsoft.com/office/word/2012/wordml" xmlns:w16cex="http://schemas.microsoft.com/office/word/2018/wordml/cex" xmlns:w16cid="http://schemas.microsoft.com/office/word/2016/wordml/cid" xmlns:w16="http://schemas.microsoft.com/office/word/2018/wordml" xmlns:w16du="http://schemas.microsoft.com/office/word/2023/wordml/word16du" xmlns:w16sdtdh="http://schemas.microsoft.com/office/word/2020/wordml/sdtdatahash" xmlns:w16se="http://schemas.microsoft.com/office/word/2015/wordml/symex" xmlns:wpg="http://schemas.microsoft.com/office/word/2010/wordprocessingGroup" xmlns:wpi="http://schemas.microsoft.com/office/word/2010/wordprocessingInk" xmlns:wne="http://schemas.microsoft.com/office/word/2006/wordml" xmlns:wps="http://schemas.microsoft.com/office/word/2010/wordprocessingShape" mc:Ignorable="w14 w15 w16se w16cid w16 w16cex w16sdtdh w16du wp14">
+<w:ftr xmlns:wpc="http://schemas.microsoft.com/office/word/2010/wordprocessingCanvas" xmlns:cx="http://schemas.microsoft.com/office/drawing/2014/chartex" xmlns:cx1="http://schemas.microsoft.com/office/drawing/2015/9/8/chartex" xmlns:cx2="http://schemas.microsoft.com/office/drawing/2015/10/21/chartex" xmlns:cx3="http://schemas.microsoft.com/office/drawing/2016/5/9/chartex" xmlns:cx4="http://schemas.microsoft.com/office/drawing/2016/5/10/chartex" xmlns:cx5="http://schemas.microsoft.com/office/drawing/2016/5/11/chartex" xmlns:cx6="http://schemas.microsoft.com/office/drawing/2016/5/12/chartex" xmlns:cx7="http://schemas.microsoft.com/office/drawing/2016/5/13/chartex" xmlns:cx8="http://schemas.microsoft.com/office/drawing/2016/5/14/chartex" xmlns:mc="http://schemas.openxmlformats.org/markup-compatibility/2006" xmlns:aink="http://schemas.microsoft.com/office/drawing/2016/ink" xmlns:am3d="http://schemas.microsoft.com/office/drawing/2017/model3d" xmlns:o="urn:schemas-microsoft-com:office:office" xmlns:oel="http://schemas.microsoft.com/office/2019/extlst" xmlns:r="http://schemas.openxmlformats.org/officeDocument/2006/relationships" xmlns:m="http://schemas.openxmlformats.org/officeDocument/2006/math" xmlns:v="urn:schemas-microsoft-com:vml" xmlns:wp14="http://schemas.microsoft.com/office/word/2010/wordprocessingDrawing" xmlns:wp="http://schemas.openxmlformats.org/drawingml/2006/wordprocessingDrawing" xmlns:w10="urn:schemas-microsoft-com:office:word" xmlns:w="http://schemas.openxmlformats.org/wordprocessingml/2006/main" xmlns:w14="http://schemas.microsoft.com/office/word/2010/wordml" xmlns:w15="http://schemas.microsoft.com/office/word/2012/wordml" xmlns:w16cex="http://schemas.microsoft.com/office/word/2018/wordml/cex" xmlns:w16cid="http://schemas.microsoft.com/office/word/2016/wordml/cid" xmlns:w16="http://schemas.microsoft.com/office/word/2018/wordml" xmlns:w16du="http://schemas.microsoft.com/office/word/2023/wordml/word16du" xmlns:w16sdtdh="http://schemas.microsoft.com/office/word/2020/wordml/sdtdatahash" xmlns:w16sdtfl="http://schemas.microsoft.com/office/word/2024/wordml/sdtformatlock" xmlns:w16se="http://schemas.microsoft.com/office/word/2015/wordml/symex" xmlns:wpg="http://schemas.microsoft.com/office/word/2010/wordprocessingGroup" xmlns:wpi="http://schemas.microsoft.com/office/word/2010/wordprocessingInk" xmlns:wne="http://schemas.microsoft.com/office/word/2006/wordml" xmlns:wps="http://schemas.microsoft.com/office/word/2010/wordprocessingShape" mc:Ignorable="w14 w15 w16se w16cid w16 w16cex w16sdtdh w16sdtfl w16du wp14">
   <w:p>
     <w:pPr>
       <w:pStyle w:val="Footer"/>
@@ -9053,7 +9512,7 @@
 </file>
 
 <file path=word/footnotes.xml><?xml version="1.0" encoding="utf-8"?>
-<w:footnotes xmlns:wpc="http://schemas.microsoft.com/office/word/2010/wordprocessingCanvas" xmlns:cx="http://schemas.microsoft.com/office/drawing/2014/chartex" xmlns:cx1="http://schemas.microsoft.com/office/drawing/2015/9/8/chartex" xmlns:cx2="http://schemas.microsoft.com/office/drawing/2015/10/21/chartex" xmlns:cx3="http://schemas.microsoft.com/office/drawing/2016/5/9/chartex" xmlns:cx4="http://schemas.microsoft.com/office/drawing/2016/5/10/chartex" xmlns:cx5="http://schemas.microsoft.com/office/drawing/2016/5/11/chartex" xmlns:cx6="http://schemas.microsoft.com/office/drawing/2016/5/12/chartex" xmlns:cx7="http://schemas.microsoft.com/office/drawing/2016/5/13/chartex" xmlns:cx8="http://schemas.microsoft.com/office/drawing/2016/5/14/chartex" xmlns:mc="http://schemas.openxmlformats.org/markup-compatibility/2006" xmlns:aink="http://schemas.microsoft.com/office/drawing/2016/ink" xmlns:am3d="http://schemas.microsoft.com/office/drawing/2017/model3d" xmlns:o="urn:schemas-microsoft-com:office:office" xmlns:oel="http://schemas.microsoft.com/office/2019/extlst" xmlns:r="http://schemas.openxmlformats.org/officeDocument/2006/relationships" xmlns:m="http://schemas.openxmlformats.org/officeDocument/2006/math" xmlns:v="urn:schemas-microsoft-com:vml" xmlns:wp14="http://schemas.microsoft.com/office/word/2010/wordprocessingDrawing" xmlns:wp="http://schemas.openxmlformats.org/drawingml/2006/wordprocessingDrawing" xmlns:w10="urn:schemas-microsoft-com:office:word" xmlns:w="http://schemas.openxmlformats.org/wordprocessingml/2006/main" xmlns:w14="http://schemas.microsoft.com/office/word/2010/wordml" xmlns:w15="http://schemas.microsoft.com/office/word/2012/wordml" xmlns:w16cex="http://schemas.microsoft.com/office/word/2018/wordml/cex" xmlns:w16cid="http://schemas.microsoft.com/office/word/2016/wordml/cid" xmlns:w16="http://schemas.microsoft.com/office/word/2018/wordml" xmlns:w16du="http://schemas.microsoft.com/office/word/2023/wordml/word16du" xmlns:w16sdtdh="http://schemas.microsoft.com/office/word/2020/wordml/sdtdatahash" xmlns:w16se="http://schemas.microsoft.com/office/word/2015/wordml/symex" xmlns:wpg="http://schemas.microsoft.com/office/word/2010/wordprocessingGroup" xmlns:wpi="http://schemas.microsoft.com/office/word/2010/wordprocessingInk" xmlns:wne="http://schemas.microsoft.com/office/word/2006/wordml" xmlns:wps="http://schemas.microsoft.com/office/word/2010/wordprocessingShape" mc:Ignorable="w14 w15 w16se w16cid w16 w16cex w16sdtdh w16du wp14">
+<w:footnotes xmlns:wpc="http://schemas.microsoft.com/office/word/2010/wordprocessingCanvas" xmlns:cx="http://schemas.microsoft.com/office/drawing/2014/chartex" xmlns:cx1="http://schemas.microsoft.com/office/drawing/2015/9/8/chartex" xmlns:cx2="http://schemas.microsoft.com/office/drawing/2015/10/21/chartex" xmlns:cx3="http://schemas.microsoft.com/office/drawing/2016/5/9/chartex" xmlns:cx4="http://schemas.microsoft.com/office/drawing/2016/5/10/chartex" xmlns:cx5="http://schemas.microsoft.com/office/drawing/2016/5/11/chartex" xmlns:cx6="http://schemas.microsoft.com/office/drawing/2016/5/12/chartex" xmlns:cx7="http://schemas.microsoft.com/office/drawing/2016/5/13/chartex" xmlns:cx8="http://schemas.microsoft.com/office/drawing/2016/5/14/chartex" xmlns:mc="http://schemas.openxmlformats.org/markup-compatibility/2006" xmlns:aink="http://schemas.microsoft.com/office/drawing/2016/ink" xmlns:am3d="http://schemas.microsoft.com/office/drawing/2017/model3d" xmlns:o="urn:schemas-microsoft-com:office:office" xmlns:oel="http://schemas.microsoft.com/office/2019/extlst" xmlns:r="http://schemas.openxmlformats.org/officeDocument/2006/relationships" xmlns:m="http://schemas.openxmlformats.org/officeDocument/2006/math" xmlns:v="urn:schemas-microsoft-com:vml" xmlns:wp14="http://schemas.microsoft.com/office/word/2010/wordprocessingDrawing" xmlns:wp="http://schemas.openxmlformats.org/drawingml/2006/wordprocessingDrawing" xmlns:w10="urn:schemas-microsoft-com:office:word" xmlns:w="http://schemas.openxmlformats.org/wordprocessingml/2006/main" xmlns:w14="http://schemas.microsoft.com/office/word/2010/wordml" xmlns:w15="http://schemas.microsoft.com/office/word/2012/wordml" xmlns:w16cex="http://schemas.microsoft.com/office/word/2018/wordml/cex" xmlns:w16cid="http://schemas.microsoft.com/office/word/2016/wordml/cid" xmlns:w16="http://schemas.microsoft.com/office/word/2018/wordml" xmlns:w16du="http://schemas.microsoft.com/office/word/2023/wordml/word16du" xmlns:w16sdtdh="http://schemas.microsoft.com/office/word/2020/wordml/sdtdatahash" xmlns:w16sdtfl="http://schemas.microsoft.com/office/word/2024/wordml/sdtformatlock" xmlns:w16se="http://schemas.microsoft.com/office/word/2015/wordml/symex" xmlns:wpg="http://schemas.microsoft.com/office/word/2010/wordprocessingGroup" xmlns:wpi="http://schemas.microsoft.com/office/word/2010/wordprocessingInk" xmlns:wne="http://schemas.microsoft.com/office/word/2006/wordml" xmlns:wps="http://schemas.microsoft.com/office/word/2010/wordprocessingShape" mc:Ignorable="w14 w15 w16se w16cid w16 w16cex w16sdtdh w16sdtfl w16du wp14">
   <w:footnote w:type="separator" w:id="-1">
     <w:p>
       <w:r>
@@ -9072,7 +9531,7 @@
 </file>
 
 <file path=word/styles.xml><?xml version="1.0" encoding="utf-8"?>
-<w:styles xmlns:mc="http://schemas.openxmlformats.org/markup-compatibility/2006" xmlns:r="http://schemas.openxmlformats.org/officeDocument/2006/relationships" xmlns:w="http://schemas.openxmlformats.org/wordprocessingml/2006/main" xmlns:w14="http://schemas.microsoft.com/office/word/2010/wordml" xmlns:w15="http://schemas.microsoft.com/office/word/2012/wordml" xmlns:w16cex="http://schemas.microsoft.com/office/word/2018/wordml/cex" xmlns:w16cid="http://schemas.microsoft.com/office/word/2016/wordml/cid" xmlns:w16="http://schemas.microsoft.com/office/word/2018/wordml" xmlns:w16du="http://schemas.microsoft.com/office/word/2023/wordml/word16du" xmlns:w16sdtdh="http://schemas.microsoft.com/office/word/2020/wordml/sdtdatahash" xmlns:w16se="http://schemas.microsoft.com/office/word/2015/wordml/symex" mc:Ignorable="w14 w15 w16se w16cid w16 w16cex w16sdtdh w16du">
+<w:styles xmlns:mc="http://schemas.openxmlformats.org/markup-compatibility/2006" xmlns:r="http://schemas.openxmlformats.org/officeDocument/2006/relationships" xmlns:w="http://schemas.openxmlformats.org/wordprocessingml/2006/main" xmlns:w14="http://schemas.microsoft.com/office/word/2010/wordml" xmlns:w15="http://schemas.microsoft.com/office/word/2012/wordml" xmlns:w16cex="http://schemas.microsoft.com/office/word/2018/wordml/cex" xmlns:w16cid="http://schemas.microsoft.com/office/word/2016/wordml/cid" xmlns:w16="http://schemas.microsoft.com/office/word/2018/wordml" xmlns:w16du="http://schemas.microsoft.com/office/word/2023/wordml/word16du" xmlns:w16sdtdh="http://schemas.microsoft.com/office/word/2020/wordml/sdtdatahash" xmlns:w16sdtfl="http://schemas.microsoft.com/office/word/2024/wordml/sdtformatlock" xmlns:w16se="http://schemas.microsoft.com/office/word/2015/wordml/symex" mc:Ignorable="w14 w15 w16se w16cid w16 w16cex w16sdtdh w16sdtfl w16du">
   <w:docDefaults>
     <w:rPrDefault>
       <w:rPr>

</xml_diff>